<commit_message>
Contenido sin numeros de unidad (UDx/U0X/Unidad 0X) para poder reordenar o renumerar el temario sin reescribirlo
- Unidades: prosa, titulos, migajas, textos de enlace, poscreditos y titulos de boletines pasan a nombres de tema o 'unidades anteriores/posteriores' (56 boletines renombrados)
- Landing, mapa del curso y diagrama u01-mapa-curso limpiados tambien (antes exentos); u02-modelo-osi y u03-cabecera-ipv4 sin etiquetas UDx
- AGENTS: nueva regla 'Numeros de unidad en el texto' + checklist; scanner scripts/check-uds.mjs (markdown de src/content/docs + SVG de public/diagrams), resto 0
- README y specs vivos de openspec actualizados; informes y openspec/changes (historico) sin tocar
- DOCX (68) y EPUB regenerados; check:diagrams 67 -> 55 fallos (u01-mapa 15 -> 3); build 183 paginas; PDF pendiente de regenerar a mano
</commit_message>
<xml_diff>
--- a/docx/01-introduccion/01-introduccion.docx
+++ b/docx/01-introduccion/01-introduccion.docx
@@ -28,13 +28,13 @@
         </w:p>
       </w:sdtContent>
     </w:sdt>
-    <w:bookmarkStart w:id="25" w:name="X79ab42d0f16af81d52f22281d0b328c003875d3"/>
+    <w:bookmarkStart w:id="25" w:name="bienvenida-al-mundo-de-las-redes"/>
     <w:p>
       <w:pPr>
         <w:pStyle w:val="Heading1"/>
       </w:pPr>
       <w:r>
-        <w:t xml:space="preserve">Unidad 01 — Bienvenida al mundo de las redes</w:t>
+        <w:t xml:space="preserve">Bienvenida al mundo de las redes</w:t>
       </w:r>
     </w:p>
     <w:p>
@@ -121,17 +121,17 @@
         <w:t xml:space="preserve">“¿por qué mi ordenador tiene una dirección?”</w:t>
       </w:r>
       <w:r>
-        <w:t xml:space="preserve">, esta Unidad 01 es para ti. En diez puntos te pongo al día para que la</w:t>
-      </w:r>
-      <w:r>
-        <w:t xml:space="preserve"> </w:t>
-      </w:r>
-      <w:r>
-        <w:rPr>
-          <w:b/>
-          <w:bCs/>
-        </w:rPr>
-        <w:t xml:space="preserve">Unidad 02</w:t>
+        <w:t xml:space="preserve">, esta primera unidad es para ti. En diez puntos te pongo al día para que la</w:t>
+      </w:r>
+      <w:r>
+        <w:t xml:space="preserve"> </w:t>
+      </w:r>
+      <w:r>
+        <w:rPr>
+          <w:b/>
+          <w:bCs/>
+        </w:rPr>
+        <w:t xml:space="preserve">unidad siguiente</w:t>
       </w:r>
       <w:r>
         <w:t xml:space="preserve"> </w:t>
@@ -163,13 +163,13 @@
           <w:b/>
           <w:bCs/>
         </w:rPr>
-        <w:t xml:space="preserve">Objetivo de la Unidad 01:</w:t>
-      </w:r>
-      <w:r>
-        <w:t xml:space="preserve"> </w:t>
-      </w:r>
-      <w:r>
-        <w:t xml:space="preserve">llegar a la U02 sabiendo</w:t>
+        <w:t xml:space="preserve">Objetivo de la unidad:</w:t>
+      </w:r>
+      <w:r>
+        <w:t xml:space="preserve"> </w:t>
+      </w:r>
+      <w:r>
+        <w:t xml:space="preserve">llegar a la unidad siguiente sabiendo</w:t>
       </w:r>
       <w:r>
         <w:t xml:space="preserve"> </w:t>
@@ -713,7 +713,7 @@
         <w:t xml:space="preserve"> </w:t>
       </w:r>
       <w:r>
-        <w:t xml:space="preserve">Cada unidad enlaza con la siguiente. La Unidad 01 va antes de la U02 a propósito.</w:t>
+        <w:t xml:space="preserve">Cada unidad enlaza con la siguiente. Lo básico va antes de lo avanzado a propósito.</w:t>
       </w:r>
     </w:p>
     <w:p>
@@ -882,13 +882,13 @@
       </w:r>
     </w:p>
     <w:bookmarkEnd w:id="21"/>
-    <w:bookmarkStart w:id="22" w:name="logros-de-la-unidad-01"/>
+    <w:bookmarkStart w:id="22" w:name="logros-de-la-unidad"/>
     <w:p>
       <w:pPr>
         <w:pStyle w:val="Heading2"/>
       </w:pPr>
       <w:r>
-        <w:t xml:space="preserve">🏆 Logros de la Unidad 01</w:t>
+        <w:t xml:space="preserve">🏆 Logros de la unidad</w:t>
       </w:r>
     </w:p>
     <w:tbl>
@@ -958,7 +958,7 @@
               <w:pStyle w:val="Compact"/>
             </w:pPr>
             <w:r>
-              <w:t xml:space="preserve">Leer la Unidad 01 completa sin saltarte ningún punto</w:t>
+              <w:t xml:space="preserve">Leer la unidad completa sin saltarte ningún punto</w:t>
             </w:r>
           </w:p>
         </w:tc>
@@ -1236,7 +1236,7 @@
         <w:pStyle w:val="FirstParagraph"/>
       </w:pPr>
       <w:r>
-        <w:t xml:space="preserve">La Unidad 01 es el vestíbulo de este curso. No tiene poscréditos propios: el vestíbulo no es una unidad con cierre, pero tienes delante una puerta abierta: la primera página de verdad.</w:t>
+        <w:t xml:space="preserve">Esta unidad es el vestíbulo de este curso. No tiene poscréditos propios: el vestíbulo no es una unidad con cierre, pero tienes delante una puerta abierta: la primera página de verdad.</w:t>
       </w:r>
     </w:p>
     <w:p>
@@ -1312,7 +1312,7 @@
           <w:b/>
           <w:bCs/>
         </w:rPr>
-        <w:t xml:space="preserve">U01 · Introducción</w:t>
+        <w:t xml:space="preserve">Introducción</w:t>
       </w:r>
       <w:r>
         <w:t xml:space="preserve"> </w:t>
@@ -3089,13 +3089,13 @@
       </w:r>
     </w:p>
     <w:bookmarkEnd w:id="39"/>
-    <w:bookmarkStart w:id="40" w:name="logros-de-la-unidad-01-1"/>
+    <w:bookmarkStart w:id="40" w:name="logros-de-la-unidad-1"/>
     <w:p>
       <w:pPr>
         <w:pStyle w:val="Heading2"/>
       </w:pPr>
       <w:r>
-        <w:t xml:space="preserve">🏆 Logros de la Unidad 01</w:t>
+        <w:t xml:space="preserve">🏆 Logros de la unidad</w:t>
       </w:r>
     </w:p>
     <w:tbl>
@@ -3165,7 +3165,7 @@
               <w:pStyle w:val="Compact"/>
             </w:pPr>
             <w:r>
-              <w:t xml:space="preserve">Leer la Unidad 01 completa sin saltarte ningún punto</w:t>
+              <w:t xml:space="preserve">Leer la unidad completa sin saltarte ningún punto</w:t>
             </w:r>
           </w:p>
         </w:tc>
@@ -3994,7 +3994,7 @@
           <w:b/>
           <w:bCs/>
         </w:rPr>
-        <w:t xml:space="preserve">U01 · Introducción</w:t>
+        <w:t xml:space="preserve">Introducción</w:t>
       </w:r>
       <w:r>
         <w:t xml:space="preserve"> </w:t>
@@ -5350,7 +5350,7 @@
         <w:t xml:space="preserve"> </w:t>
       </w:r>
       <w:r>
-        <w:t xml:space="preserve">Solución: desconectar uno de los dos extremos. Esto se estudiará en profundidad en la UD4 (STP).</w:t>
+        <w:t xml:space="preserve">Solución: desconectar uno de los dos extremos. Esto se estudiará en profundidad en una unidad posterior (STP).</w:t>
       </w:r>
     </w:p>
     <w:p>
@@ -6272,7 +6272,7 @@
           <w:b/>
           <w:bCs/>
         </w:rPr>
-        <w:t xml:space="preserve">U01 · Introducción</w:t>
+        <w:t xml:space="preserve">Introducción</w:t>
       </w:r>
       <w:r>
         <w:t xml:space="preserve"> </w:t>
@@ -8689,7 +8689,7 @@
           <w:b/>
           <w:bCs/>
         </w:rPr>
-        <w:t xml:space="preserve">U01 · Introducción</w:t>
+        <w:t xml:space="preserve">Introducción</w:t>
       </w:r>
       <w:r>
         <w:t xml:space="preserve"> </w:t>
@@ -9729,18 +9729,10 @@
       </w:r>
       <w:r>
         <w:rPr>
-          <w:rFonts w:hint="eastAsia"/>
           <w:i/>
           <w:iCs/>
         </w:rPr>
-        <w:t xml:space="preserve">“CONRAD,当他envía</w:t>
-      </w:r>
-      <w:r>
-        <w:rPr>
-          <w:i/>
-          <w:iCs/>
-        </w:rPr>
-        <w:t xml:space="preserve"> un PDF por WhatsApp, ¿viaja entero por el cable?”</w:t>
+        <w:t xml:space="preserve">“CONRAD, cuando envío un PDF por WhatsApp, ¿viaja entero por el cable?”</w:t>
       </w:r>
       <w:r>
         <w:t xml:space="preserve"> </w:t>
@@ -11198,7 +11190,7 @@
           <w:b/>
           <w:bCs/>
         </w:rPr>
-        <w:t xml:space="preserve">U01 · Introducción</w:t>
+        <w:t xml:space="preserve">Introducción</w:t>
       </w:r>
       <w:r>
         <w:t xml:space="preserve"> </w:t>
@@ -13572,7 +13564,7 @@
           <w:b/>
           <w:bCs/>
         </w:rPr>
-        <w:t xml:space="preserve">U01 · Introducción</w:t>
+        <w:t xml:space="preserve">Introducción</w:t>
       </w:r>
       <w:r>
         <w:t xml:space="preserve"> </w:t>
@@ -16598,7 +16590,7 @@
           <w:b/>
           <w:bCs/>
         </w:rPr>
-        <w:t xml:space="preserve">PRÓXIMAMENTE EN UD2:</w:t>
+        <w:t xml:space="preserve">PRÓXIMAMENTE:</w:t>
       </w:r>
       <w:r>
         <w:t xml:space="preserve"> </w:t>
@@ -16737,7 +16729,7 @@
           <w:b/>
           <w:bCs/>
         </w:rPr>
-        <w:t xml:space="preserve">U01 · Introducción</w:t>
+        <w:t xml:space="preserve">Introducción</w:t>
       </w:r>
       <w:r>
         <w:t xml:space="preserve"> </w:t>
@@ -17955,30 +17947,13 @@
       </w:r>
       <w:r>
         <w:rPr>
-          <w:rFonts w:hint="eastAsia"/>
-          <w:b/>
-          <w:bCs/>
-        </w:rPr>
-        <w:t xml:space="preserve">no模拟a</w:t>
-      </w:r>
-      <w:r>
-        <w:rPr>
-          <w:b/>
-          <w:bCs/>
-        </w:rPr>
-        <w:t xml:space="preserve"> todo</w:t>
-      </w:r>
-      <w:r>
-        <w:t xml:space="preserve">: por ejemplo, no puedes ver </w:t>
-      </w:r>
-      <w:r>
-        <w:rPr>
-          <w:rFonts w:hint="eastAsia"/>
-        </w:rPr>
-        <w:t xml:space="preserve">LEDs物理icos,</w:t>
-      </w:r>
-      <w:r>
-        <w:t xml:space="preserve"> no puedes probar fibra óptica, y algunos protocolos avanzados no estánimplementados al 100%.</w:t>
+          <w:b/>
+          <w:bCs/>
+        </w:rPr>
+        <w:t xml:space="preserve">no simula todo</w:t>
+      </w:r>
+      <w:r>
+        <w:t xml:space="preserve">: por ejemplo, no puedes ver LEDs físicos, no puedes probar fibra óptica, y algunos protocolos avanzados no están implementados al 100%.</w:t>
       </w:r>
     </w:p>
     <w:p>
@@ -18298,16 +18273,7 @@
         <w:t xml:space="preserve"> </w:t>
       </w:r>
       <w:r>
-        <w:t xml:space="preserve">Cisco </w:t>
-      </w:r>
-      <w:r>
-        <w:rPr>
-          <w:rFonts w:hint="eastAsia"/>
-        </w:rPr>
-        <w:t xml:space="preserve">proporciona版本</w:t>
-      </w:r>
-      <w:r>
-        <w:t xml:space="preserve"> para Windows y Linux. La instalación en Linux es igual de sencilla: descargas el paquete</w:t>
+        <w:t xml:space="preserve">Cisco proporciona versiones para Windows y Linux. La instalación en Linux es igual de sencilla: descargas el paquete</w:t>
       </w:r>
       <w:r>
         <w:t xml:space="preserve"> </w:t>
@@ -18539,7 +18505,7 @@
           <w:b/>
           <w:bCs/>
         </w:rPr>
-        <w:t xml:space="preserve">U01 · Introducción</w:t>
+        <w:t xml:space="preserve">Introducción</w:t>
       </w:r>
       <w:r>
         <w:t xml:space="preserve"> </w:t>
@@ -18603,7 +18569,7 @@
         <w:t xml:space="preserve">dónde estás, qué paradas hay y qué vas a saber hacer al bajarte de cada una</w:t>
       </w:r>
       <w:r>
-        <w:t xml:space="preserve">. Así, cuando estés en la UD3 calculando subredes, sabrás exactamente para qué lo estás haciendo.</w:t>
+        <w:t xml:space="preserve">. Así, cuando estés en la unidad de dirección IP calculando subredes, sabrás exactamente para qué lo estás haciendo.</w:t>
       </w:r>
     </w:p>
     <w:p>
@@ -18714,7 +18680,7 @@
                 <w:b/>
                 <w:bCs/>
               </w:rPr>
-              <w:t xml:space="preserve">UD2 · Ethernet, medios y cableado</w:t>
+              <w:t xml:space="preserve">Ethernet, medios y cableado</w:t>
             </w:r>
           </w:p>
         </w:tc>
@@ -18736,7 +18702,7 @@
               <w:pStyle w:val="Compact"/>
             </w:pPr>
             <w:r>
-              <w:t xml:space="preserve">Esta Unidad 01</w:t>
+              <w:t xml:space="preserve">La introducción</w:t>
             </w:r>
           </w:p>
         </w:tc>
@@ -18770,7 +18736,7 @@
                 <w:b/>
                 <w:bCs/>
               </w:rPr>
-              <w:t xml:space="preserve">UD3 · Direccionamiento IP y subnetting</w:t>
+              <w:t xml:space="preserve">Direccionamiento IP y subnetting</w:t>
             </w:r>
           </w:p>
         </w:tc>
@@ -18792,7 +18758,7 @@
               <w:pStyle w:val="Compact"/>
             </w:pPr>
             <w:r>
-              <w:t xml:space="preserve">Las IPs de la Unidad 01 y el medio de la UD2</w:t>
+              <w:t xml:space="preserve">Las IPs y el medio (Ethernet y cableado)</w:t>
             </w:r>
           </w:p>
         </w:tc>
@@ -18826,7 +18792,7 @@
                 <w:b/>
                 <w:bCs/>
               </w:rPr>
-              <w:t xml:space="preserve">UD4 · Switching y VLAN</w:t>
+              <w:t xml:space="preserve">Switching y VLAN</w:t>
             </w:r>
           </w:p>
         </w:tc>
@@ -18848,7 +18814,7 @@
               <w:pStyle w:val="Compact"/>
             </w:pPr>
             <w:r>
-              <w:t xml:space="preserve">Qué hace un switch (Unidad 01) y las IPs (UD3)</w:t>
+              <w:t xml:space="preserve">Qué hace un switch (introducción) y las IPs (dirección IP)</w:t>
             </w:r>
           </w:p>
         </w:tc>
@@ -18882,7 +18848,7 @@
                 <w:b/>
                 <w:bCs/>
               </w:rPr>
-              <w:t xml:space="preserve">UD5 · Trunking e inter-VLAN</w:t>
+              <w:t xml:space="preserve">Trunking e inter-VLAN</w:t>
             </w:r>
           </w:p>
         </w:tc>
@@ -18904,7 +18870,7 @@
               <w:pStyle w:val="Compact"/>
             </w:pPr>
             <w:r>
-              <w:t xml:space="preserve">Switching y VLANs (UD4)</w:t>
+              <w:t xml:space="preserve">Switching y VLANs</w:t>
             </w:r>
           </w:p>
         </w:tc>
@@ -18938,7 +18904,7 @@
                 <w:b/>
                 <w:bCs/>
               </w:rPr>
-              <w:t xml:space="preserve">UD6 · Enrutamiento estático</w:t>
+              <w:t xml:space="preserve">Enrutamiento estático</w:t>
             </w:r>
           </w:p>
         </w:tc>
@@ -18960,7 +18926,7 @@
               <w:pStyle w:val="Compact"/>
             </w:pPr>
             <w:r>
-              <w:t xml:space="preserve">Subredes (UD3) y routers entre VLANs (UD5)</w:t>
+              <w:t xml:space="preserve">Subredes (dirección IP) y routers entre VLANs (trunking)</w:t>
             </w:r>
           </w:p>
         </w:tc>
@@ -18994,7 +18960,7 @@
                 <w:b/>
                 <w:bCs/>
               </w:rPr>
-              <w:t xml:space="preserve">UD7 · OSPF</w:t>
+              <w:t xml:space="preserve">OSPF</w:t>
             </w:r>
           </w:p>
         </w:tc>
@@ -19016,7 +18982,7 @@
               <w:pStyle w:val="Compact"/>
             </w:pPr>
             <w:r>
-              <w:t xml:space="preserve">Enrutamiento estático (UD6)</w:t>
+              <w:t xml:space="preserve">Enrutamiento estático</w:t>
             </w:r>
           </w:p>
         </w:tc>
@@ -19050,7 +19016,7 @@
                 <w:b/>
                 <w:bCs/>
               </w:rPr>
-              <w:t xml:space="preserve">UD8 · ACL y seguridad</w:t>
+              <w:t xml:space="preserve">ACL y seguridad</w:t>
             </w:r>
           </w:p>
         </w:tc>
@@ -19072,7 +19038,7 @@
               <w:pStyle w:val="Compact"/>
             </w:pPr>
             <w:r>
-              <w:t xml:space="preserve">IPs y subredes (UD3) y routing (UD6-UD7)</w:t>
+              <w:t xml:space="preserve">IPs y subredes (dirección IP) y routing (estático y OSPF)</w:t>
             </w:r>
           </w:p>
         </w:tc>
@@ -19106,7 +19072,7 @@
                 <w:b/>
                 <w:bCs/>
               </w:rPr>
-              <w:t xml:space="preserve">UD9 · NAT y PAT</w:t>
+              <w:t xml:space="preserve">NAT y PAT</w:t>
             </w:r>
           </w:p>
         </w:tc>
@@ -19128,7 +19094,7 @@
               <w:pStyle w:val="Compact"/>
             </w:pPr>
             <w:r>
-              <w:t xml:space="preserve">Routing (UD6-UD7) y subredes (UD3)</w:t>
+              <w:t xml:space="preserve">Routing (estático y OSPF) y subredes (dirección IP)</w:t>
             </w:r>
           </w:p>
         </w:tc>
@@ -19162,7 +19128,7 @@
                 <w:b/>
                 <w:bCs/>
               </w:rPr>
-              <w:t xml:space="preserve">UD10 · Servicios de red</w:t>
+              <w:t xml:space="preserve">Servicios de red</w:t>
             </w:r>
           </w:p>
         </w:tc>
@@ -19184,7 +19150,7 @@
               <w:pStyle w:val="Compact"/>
             </w:pPr>
             <w:r>
-              <w:t xml:space="preserve">IPs (UD3) y routing (UD6)</w:t>
+              <w:t xml:space="preserve">IPs (dirección IP) y routing (estático)</w:t>
             </w:r>
           </w:p>
         </w:tc>
@@ -19218,7 +19184,7 @@
                 <w:b/>
                 <w:bCs/>
               </w:rPr>
-              <w:t xml:space="preserve">UD11 · Redes inalámbricas</w:t>
+              <w:t xml:space="preserve">Redes inalámbricas</w:t>
             </w:r>
           </w:p>
         </w:tc>
@@ -19240,7 +19206,7 @@
               <w:pStyle w:val="Compact"/>
             </w:pPr>
             <w:r>
-              <w:t xml:space="preserve">Cableado (UD2), IPs (UD3) y VLANs (UD4)</w:t>
+              <w:t xml:space="preserve">Cableado (Ethernet), IPs (dirección IP) y VLANs (switching)</w:t>
             </w:r>
           </w:p>
         </w:tc>
@@ -19274,7 +19240,7 @@
                 <w:b/>
                 <w:bCs/>
               </w:rPr>
-              <w:t xml:space="preserve">UD12 · Alta disponibilidad</w:t>
+              <w:t xml:space="preserve">Alta disponibilidad</w:t>
             </w:r>
           </w:p>
         </w:tc>
@@ -19296,7 +19262,7 @@
               <w:pStyle w:val="Compact"/>
             </w:pPr>
             <w:r>
-              <w:t xml:space="preserve">Switching (UD4), trunks (UD5) y routing (UD6)</w:t>
+              <w:t xml:space="preserve">Switching, trunks y routing (estático)</w:t>
             </w:r>
           </w:p>
         </w:tc>
@@ -19335,7 +19301,7 @@
         <w:t xml:space="preserve"> </w:t>
       </w:r>
       <w:r>
-        <w:t xml:space="preserve">del curso: si te saltas un peldaño, el siguiente te va a costar el doble. La Unidad 01 (estas páginas) es el vestíbulo: sin él, la UD2 te sonará a chino.</w:t>
+        <w:t xml:space="preserve">del curso: si te saltas un peldaño, el siguiente te va a costar el doble. La introducción (estas páginas) es el vestíbulo: sin ella, Ethernet te sonará a chino.</w:t>
       </w:r>
     </w:p>
     <w:p>
@@ -19347,7 +19313,7 @@
           <wp:inline>
             <wp:extent cx="5334000" cy="2436834"/>
             <wp:effectExtent b="0" l="0" r="0" t="0"/>
-            <wp:docPr descr="Las 12 etapas del curso en dos cuatrimestres: de la Unidad 01 a la alta disponibilidad" title="" id="155" name="Picture"/>
+            <wp:docPr descr="Las 12 etapas del curso en dos cuatrimestres: a la alta disponibilidad" title="" id="155" name="Picture"/>
             <a:graphic>
               <a:graphicData uri="http://schemas.openxmlformats.org/drawingml/2006/picture">
                 <pic:pic>
@@ -19399,7 +19365,7 @@
         <w:pStyle w:val="ImageCaption"/>
       </w:pPr>
       <w:r>
-        <w:t xml:space="preserve">Las 12 etapas del curso en dos cuatrimestres: de la Unidad 01 a la alta disponibilidad</w:t>
+        <w:t xml:space="preserve">Las 12 etapas del curso en dos cuatrimestres: a la alta disponibilidad</w:t>
       </w:r>
     </w:p>
     <w:p>
@@ -19489,7 +19455,7 @@
                 <w:b/>
                 <w:bCs/>
               </w:rPr>
-              <w:t xml:space="preserve">Unidad 01</w:t>
+              <w:t xml:space="preserve">La introducción</w:t>
             </w:r>
           </w:p>
         </w:tc>
@@ -19695,18 +19661,18 @@
               <w:pStyle w:val="Compact"/>
             </w:pPr>
             <w:r>
-              <w:t xml:space="preserve">UD3 · IPv6</w:t>
-            </w:r>
-          </w:p>
-        </w:tc>
-        <w:tc>
-          <w:tcPr/>
-          <w:p>
-            <w:pPr>
-              <w:pStyle w:val="Compact"/>
-            </w:pPr>
-            <w:r>
-              <w:t xml:space="preserve">UD3 · IPv4</w:t>
+              <w:t xml:space="preserve">IPv6</w:t>
+            </w:r>
+          </w:p>
+        </w:tc>
+        <w:tc>
+          <w:tcPr/>
+          <w:p>
+            <w:pPr>
+              <w:pStyle w:val="Compact"/>
+            </w:pPr>
+            <w:r>
+              <w:t xml:space="preserve">IPv4</w:t>
             </w:r>
           </w:p>
         </w:tc>
@@ -19730,18 +19696,18 @@
               <w:pStyle w:val="Compact"/>
             </w:pPr>
             <w:r>
-              <w:t xml:space="preserve">UD4 · VLANs</w:t>
-            </w:r>
-          </w:p>
-        </w:tc>
-        <w:tc>
-          <w:tcPr/>
-          <w:p>
-            <w:pPr>
-              <w:pStyle w:val="Compact"/>
-            </w:pPr>
-            <w:r>
-              <w:t xml:space="preserve">UD4 · Switching</w:t>
+              <w:t xml:space="preserve">VLANs</w:t>
+            </w:r>
+          </w:p>
+        </w:tc>
+        <w:tc>
+          <w:tcPr/>
+          <w:p>
+            <w:pPr>
+              <w:pStyle w:val="Compact"/>
+            </w:pPr>
+            <w:r>
+              <w:t xml:space="preserve">Switching</w:t>
             </w:r>
           </w:p>
         </w:tc>
@@ -19765,18 +19731,18 @@
               <w:pStyle w:val="Compact"/>
             </w:pPr>
             <w:r>
-              <w:t xml:space="preserve">UD5 · Trunking</w:t>
-            </w:r>
-          </w:p>
-        </w:tc>
-        <w:tc>
-          <w:tcPr/>
-          <w:p>
-            <w:pPr>
-              <w:pStyle w:val="Compact"/>
-            </w:pPr>
-            <w:r>
-              <w:t xml:space="preserve">UD4 · VLANs</w:t>
+              <w:t xml:space="preserve">Trunking</w:t>
+            </w:r>
+          </w:p>
+        </w:tc>
+        <w:tc>
+          <w:tcPr/>
+          <w:p>
+            <w:pPr>
+              <w:pStyle w:val="Compact"/>
+            </w:pPr>
+            <w:r>
+              <w:t xml:space="preserve">VLANs</w:t>
             </w:r>
           </w:p>
         </w:tc>
@@ -19800,18 +19766,18 @@
               <w:pStyle w:val="Compact"/>
             </w:pPr>
             <w:r>
-              <w:t xml:space="preserve">UD7 · OSPF</w:t>
-            </w:r>
-          </w:p>
-        </w:tc>
-        <w:tc>
-          <w:tcPr/>
-          <w:p>
-            <w:pPr>
-              <w:pStyle w:val="Compact"/>
-            </w:pPr>
-            <w:r>
-              <w:t xml:space="preserve">UD6 · Routing estático</w:t>
+              <w:t xml:space="preserve">OSPF</w:t>
+            </w:r>
+          </w:p>
+        </w:tc>
+        <w:tc>
+          <w:tcPr/>
+          <w:p>
+            <w:pPr>
+              <w:pStyle w:val="Compact"/>
+            </w:pPr>
+            <w:r>
+              <w:t xml:space="preserve">Enrutamiento estático</w:t>
             </w:r>
           </w:p>
         </w:tc>
@@ -19835,18 +19801,18 @@
               <w:pStyle w:val="Compact"/>
             </w:pPr>
             <w:r>
-              <w:t xml:space="preserve">UD9 · NAT</w:t>
-            </w:r>
-          </w:p>
-        </w:tc>
-        <w:tc>
-          <w:tcPr/>
-          <w:p>
-            <w:pPr>
-              <w:pStyle w:val="Compact"/>
-            </w:pPr>
-            <w:r>
-              <w:t xml:space="preserve">UD3 + UD6</w:t>
+              <w:t xml:space="preserve">NAT</w:t>
+            </w:r>
+          </w:p>
+        </w:tc>
+        <w:tc>
+          <w:tcPr/>
+          <w:p>
+            <w:pPr>
+              <w:pStyle w:val="Compact"/>
+            </w:pPr>
+            <w:r>
+              <w:t xml:space="preserve">Dirección IP + Enrutamiento estático</w:t>
             </w:r>
           </w:p>
         </w:tc>
@@ -19870,18 +19836,18 @@
               <w:pStyle w:val="Compact"/>
             </w:pPr>
             <w:r>
-              <w:t xml:space="preserve">UD10 · Servicios</w:t>
-            </w:r>
-          </w:p>
-        </w:tc>
-        <w:tc>
-          <w:tcPr/>
-          <w:p>
-            <w:pPr>
-              <w:pStyle w:val="Compact"/>
-            </w:pPr>
-            <w:r>
-              <w:t xml:space="preserve">UD3 + UD6</w:t>
+              <w:t xml:space="preserve">Servicios</w:t>
+            </w:r>
+          </w:p>
+        </w:tc>
+        <w:tc>
+          <w:tcPr/>
+          <w:p>
+            <w:pPr>
+              <w:pStyle w:val="Compact"/>
+            </w:pPr>
+            <w:r>
+              <w:t xml:space="preserve">Dirección IP + Enrutamiento estático</w:t>
             </w:r>
           </w:p>
         </w:tc>
@@ -19905,18 +19871,18 @@
               <w:pStyle w:val="Compact"/>
             </w:pPr>
             <w:r>
-              <w:t xml:space="preserve">UD12 · Alta disponibilidad</w:t>
-            </w:r>
-          </w:p>
-        </w:tc>
-        <w:tc>
-          <w:tcPr/>
-          <w:p>
-            <w:pPr>
-              <w:pStyle w:val="Compact"/>
-            </w:pPr>
-            <w:r>
-              <w:t xml:space="preserve">UD4 + UD5 + UD6</w:t>
+              <w:t xml:space="preserve">Alta disponibilidad</w:t>
+            </w:r>
+          </w:p>
+        </w:tc>
+        <w:tc>
+          <w:tcPr/>
+          <w:p>
+            <w:pPr>
+              <w:pStyle w:val="Compact"/>
+            </w:pPr>
+            <w:r>
+              <w:t xml:space="preserve">Switching + Trunking + Enrutamiento estático</w:t>
             </w:r>
           </w:p>
         </w:tc>
@@ -20083,7 +20049,7 @@
               <w:pStyle w:val="Compact"/>
             </w:pPr>
             <w:r>
-              <w:t xml:space="preserve">UD2 → UD6</w:t>
+              <w:t xml:space="preserve">Ethernet → Enrutamiento estático</w:t>
             </w:r>
           </w:p>
         </w:tc>
@@ -20128,7 +20094,7 @@
               <w:pStyle w:val="Compact"/>
             </w:pPr>
             <w:r>
-              <w:t xml:space="preserve">UD7 → UD12</w:t>
+              <w:t xml:space="preserve">OSPF → Alta disponibilidad</w:t>
             </w:r>
           </w:p>
         </w:tc>
@@ -20154,7 +20120,7 @@
           <w:b/>
           <w:bCs/>
         </w:rPr>
-        <w:t xml:space="preserve">Primer cuatrimestre (UD2–UD6).</w:t>
+        <w:t xml:space="preserve">Primer cuatrimestre (del cableado al enrutamiento estático).</w:t>
       </w:r>
       <w:r>
         <w:t xml:space="preserve"> </w:t>
@@ -20185,7 +20151,7 @@
           <w:b/>
           <w:bCs/>
         </w:rPr>
-        <w:t xml:space="preserve">Segundo cuatrimestre (UD7–UD12).</w:t>
+        <w:t xml:space="preserve">Segundo cuatrimestre (de OSPF a la alta disponibilidad).</w:t>
       </w:r>
       <w:r>
         <w:t xml:space="preserve"> </w:t>
@@ -20362,7 +20328,7 @@
         <w:t xml:space="preserve"> </w:t>
       </w:r>
       <w:r>
-        <w:t xml:space="preserve">un switch. Si no sabes qué hace un switch (UD4), la VLAN (UD4) es un acto de fe.</w:t>
+        <w:t xml:space="preserve">un switch. Si no sabes qué hace un switch, la VLAN es un acto de fe.</w:t>
       </w:r>
     </w:p>
     <w:p>
@@ -20397,7 +20363,7 @@
         <w:t xml:space="preserve">según su dirección IP</w:t>
       </w:r>
       <w:r>
-        <w:t xml:space="preserve">. Si no dominas las subredes (UD3), no hay nada que enrutar (UD6).</w:t>
+        <w:t xml:space="preserve">. Si no dominas las subredes (dirección IP), no hay nada que enrutar (enrutamiento estático).</w:t>
       </w:r>
     </w:p>
     <w:p>
@@ -20419,7 +20385,7 @@
         <w:t xml:space="preserve"> </w:t>
       </w:r>
       <w:r>
-        <w:t xml:space="preserve">Tu red privada usa direcciones de casa; para salir al mundo necesita NAT (UD9), que depende del routing (UD6-UD7) y de que entiendas qué es una IP pública.</w:t>
+        <w:t xml:space="preserve">Tu red privada usa direcciones de casa; para salir al mundo necesita NAT, que depende del routing (estático y OSPF) y de que entiendas qué es una IP pública.</w:t>
       </w:r>
     </w:p>
     <w:p>
@@ -20541,7 +20507,7 @@
         <w:t xml:space="preserve"> </w:t>
       </w:r>
       <w:r>
-        <w:t xml:space="preserve">por la dirección del destino: los servicios de la UD10 están ahí desde el primer minuto, aunque no los veas. El paquete nace dentro de tu red local.</w:t>
+        <w:t xml:space="preserve">por la dirección del destino: los servicios de red están ahí desde el primer minuto, aunque no los veas. El paquete nace dentro de tu red local.</w:t>
       </w:r>
     </w:p>
     <w:p>
@@ -20588,7 +20554,7 @@
         <w:t xml:space="preserve"> </w:t>
       </w:r>
       <w:r>
-        <w:t xml:space="preserve">cuando la dirección apunta fuera (y si viene de otra VLAN, antes cruzó el trunk de la UD5). El router mira la dirección, decide la mejor ruta (UD6-UD7) y, si el destino está en Internet, el paquete sale disfrazado por</w:t>
+        <w:t xml:space="preserve">cuando la dirección apunta fuera (y si viene de otra VLAN, antes cruzó un trunk). El router mira la dirección, decide la mejor ruta (estática u OSPF) y, si el destino está en Internet, el paquete sale disfrazado por</w:t>
       </w:r>
       <w:r>
         <w:t xml:space="preserve"> </w:t>
@@ -20601,10 +20567,7 @@
         <w:t xml:space="preserve">NAT</w:t>
       </w:r>
       <w:r>
-        <w:t xml:space="preserve"> </w:t>
-      </w:r>
-      <w:r>
-        <w:t xml:space="preserve">(UD9): la IP privada de casa se cambia por la IP pública de la conexión. Ya está en el mundo.</w:t>
+        <w:t xml:space="preserve">: la IP privada de casa se cambia por la IP pública de la conexión. Ya está en el mundo.</w:t>
       </w:r>
     </w:p>
     <w:p>
@@ -20622,7 +20585,7 @@
         <w:t xml:space="preserve"> </w:t>
       </w:r>
       <w:r>
-        <w:t xml:space="preserve">El servidor de destino recibe el paquete, lo procesa y envía la respuesta por el camino (quizá distinto) de vuelta a casa. Por el camino, el paquete puede cruzar un tramo inalámbrico (UD11) y confía en que, si algún equipo se cae, la red tenga un plan B (UD12). Cuando la respuesta llega a tu pantalla, el viaje del paquete ha terminado… y este curso te habrá enseñado a acompañarlo en cada tramo.</w:t>
+        <w:t xml:space="preserve">El servidor de destino recibe el paquete, lo procesa y envía la respuesta por el camino (quizá distinto) de vuelta a casa. Por el camino, el paquete puede cruzar un tramo inalámbrico y confía en que, si algún equipo se cae, la red tenga un plan B (alta disponibilidad). Cuando la respuesta llega a tu pantalla, el viaje del paquete ha terminado… y este curso te habrá enseñado a acompañarlo en cada tramo.</w:t>
       </w:r>
     </w:p>
     <w:p>
@@ -20700,7 +20663,7 @@
               <w:pStyle w:val="Compact"/>
             </w:pPr>
             <w:r>
-              <w:t xml:space="preserve">UD10 · Servicios (DHCP y DNS)</w:t>
+              <w:t xml:space="preserve">Servicios de red (DHCP y DNS)</w:t>
             </w:r>
           </w:p>
         </w:tc>
@@ -20724,7 +20687,7 @@
               <w:pStyle w:val="Compact"/>
             </w:pPr>
             <w:r>
-              <w:t xml:space="preserve">UD2 · Ethernet y UD4 · Switching y VLAN</w:t>
+              <w:t xml:space="preserve">Ethernet y cableado + Switching y VLAN</w:t>
             </w:r>
           </w:p>
         </w:tc>
@@ -20748,7 +20711,7 @@
               <w:pStyle w:val="Compact"/>
             </w:pPr>
             <w:r>
-              <w:t xml:space="preserve">UD5 · Trunking e inter-VLAN</w:t>
+              <w:t xml:space="preserve">Trunking e inter-VLAN</w:t>
             </w:r>
           </w:p>
         </w:tc>
@@ -20772,7 +20735,7 @@
               <w:pStyle w:val="Compact"/>
             </w:pPr>
             <w:r>
-              <w:t xml:space="preserve">UD6 · Enrutamiento estático y UD7 · OSPF</w:t>
+              <w:t xml:space="preserve">Enrutamiento estático y OSPF</w:t>
             </w:r>
           </w:p>
         </w:tc>
@@ -20796,7 +20759,7 @@
               <w:pStyle w:val="Compact"/>
             </w:pPr>
             <w:r>
-              <w:t xml:space="preserve">UD8 · ACL y seguridad</w:t>
+              <w:t xml:space="preserve">ACL y seguridad</w:t>
             </w:r>
           </w:p>
         </w:tc>
@@ -20820,7 +20783,7 @@
               <w:pStyle w:val="Compact"/>
             </w:pPr>
             <w:r>
-              <w:t xml:space="preserve">UD9 · NAT y PAT</w:t>
+              <w:t xml:space="preserve">NAT y PAT</w:t>
             </w:r>
           </w:p>
         </w:tc>
@@ -20844,7 +20807,7 @@
               <w:pStyle w:val="Compact"/>
             </w:pPr>
             <w:r>
-              <w:t xml:space="preserve">UD11 · Redes inalámbricas</w:t>
+              <w:t xml:space="preserve">Redes inalámbricas</w:t>
             </w:r>
           </w:p>
         </w:tc>
@@ -20868,7 +20831,7 @@
               <w:pStyle w:val="Compact"/>
             </w:pPr>
             <w:r>
-              <w:t xml:space="preserve">UD12 · Alta disponibilidad</w:t>
+              <w:t xml:space="preserve">Alta disponibilidad</w:t>
             </w:r>
           </w:p>
         </w:tc>
@@ -21043,7 +21006,7 @@
         <w:t xml:space="preserve"> </w:t>
       </w:r>
       <w:r>
-        <w:t xml:space="preserve">la red (UD2-UD6) y</w:t>
+        <w:t xml:space="preserve">la red (del cableado al enrutamiento) y</w:t>
       </w:r>
       <w:r>
         <w:t xml:space="preserve"> </w:t>
@@ -21059,7 +21022,7 @@
         <w:t xml:space="preserve"> </w:t>
       </w:r>
       <w:r>
-        <w:t xml:space="preserve">(UD7-UD12).</w:t>
+        <w:t xml:space="preserve">(de OSPF a la alta disponibilidad).</w:t>
       </w:r>
     </w:p>
     <w:p>
@@ -21197,7 +21160,7 @@
           <w:b/>
           <w:bCs/>
         </w:rPr>
-        <w:t xml:space="preserve">U01 · Introducción</w:t>
+        <w:t xml:space="preserve">Introducción</w:t>
       </w:r>
       <w:r>
         <w:t xml:space="preserve"> </w:t>
@@ -23591,7 +23554,7 @@
           <w:b/>
           <w:bCs/>
         </w:rPr>
-        <w:t xml:space="preserve">U01 · Introducción</w:t>
+        <w:t xml:space="preserve">Introducción</w:t>
       </w:r>
       <w:r>
         <w:t xml:space="preserve"> </w:t>
@@ -25699,17 +25662,17 @@
         <w:t xml:space="preserve"> </w:t>
       </w:r>
       <w:r>
-        <w:t xml:space="preserve">termina la Unidad 01. Has llegado hasta aquí, y eso significa que ya sabes qué es una red, cómo se monta, cómo se diagnostica y qué palabras clave necesitas.</w:t>
-      </w:r>
-      <w:r>
-        <w:t xml:space="preserve"> </w:t>
-      </w:r>
-      <w:r>
-        <w:rPr>
-          <w:b/>
-          <w:bCs/>
-        </w:rPr>
-        <w:t xml:space="preserve">Estás listo para la UD1.</w:t>
+        <w:t xml:space="preserve">termina la unidad. Has llegado hasta aquí, y eso significa que ya sabes qué es una red, cómo se monta, cómo se diagnostica y qué palabras clave necesitas.</w:t>
+      </w:r>
+      <w:r>
+        <w:t xml:space="preserve"> </w:t>
+      </w:r>
+      <w:r>
+        <w:rPr>
+          <w:b/>
+          <w:bCs/>
+        </w:rPr>
+        <w:t xml:space="preserve">Estás listo para la siguiente unidad.</w:t>
       </w:r>
     </w:p>
     <w:p>

</xml_diff>

<commit_message>
Reorganización del temario: Servicios→U6, estático→U7, OSPF→U8, ACL→U10
</commit_message>
<xml_diff>
--- a/docx/01-introduccion/01-introduccion.docx
+++ b/docx/01-introduccion/01-introduccion.docx
@@ -23781,6 +23781,62 @@
               <w:pStyle w:val="Compact"/>
             </w:pPr>
             <w:r>
+              <w:t xml:space="preserve">🗄️</w:t>
+            </w:r>
+            <w:r>
+              <w:t xml:space="preserve"> </w:t>
+            </w:r>
+            <w:r>
+              <w:rPr>
+                <w:b/>
+                <w:bCs/>
+              </w:rPr>
+              <w:t xml:space="preserve">Servicios de red</w:t>
+            </w:r>
+          </w:p>
+        </w:tc>
+        <w:tc>
+          <w:tcPr/>
+          <w:p>
+            <w:pPr>
+              <w:pStyle w:val="Compact"/>
+            </w:pPr>
+            <w:r>
+              <w:t xml:space="preserve">Desplegar DHCP, DNS y NTP y diagnosticarlos</w:t>
+            </w:r>
+          </w:p>
+        </w:tc>
+        <w:tc>
+          <w:tcPr/>
+          <w:p>
+            <w:pPr>
+              <w:pStyle w:val="Compact"/>
+            </w:pPr>
+            <w:r>
+              <w:t xml:space="preserve">IPs (dirección IP), switches y VLANs (switching) y trunks (trunking)</w:t>
+            </w:r>
+          </w:p>
+        </w:tc>
+      </w:tr>
+      <w:tr>
+        <w:tc>
+          <w:tcPr/>
+          <w:p>
+            <w:pPr>
+              <w:pStyle w:val="Compact"/>
+            </w:pPr>
+            <w:r>
+              <w:t xml:space="preserve">6</w:t>
+            </w:r>
+          </w:p>
+        </w:tc>
+        <w:tc>
+          <w:tcPr/>
+          <w:p>
+            <w:pPr>
+              <w:pStyle w:val="Compact"/>
+            </w:pPr>
+            <w:r>
               <w:t xml:space="preserve">🧭</w:t>
             </w:r>
             <w:r>
@@ -23826,7 +23882,7 @@
               <w:pStyle w:val="Compact"/>
             </w:pPr>
             <w:r>
-              <w:t xml:space="preserve">6</w:t>
+              <w:t xml:space="preserve">7</w:t>
             </w:r>
           </w:p>
         </w:tc>
@@ -23882,7 +23938,63 @@
               <w:pStyle w:val="Compact"/>
             </w:pPr>
             <w:r>
-              <w:t xml:space="preserve">7</w:t>
+              <w:t xml:space="preserve">8</w:t>
+            </w:r>
+          </w:p>
+        </w:tc>
+        <w:tc>
+          <w:tcPr/>
+          <w:p>
+            <w:pPr>
+              <w:pStyle w:val="Compact"/>
+            </w:pPr>
+            <w:r>
+              <w:t xml:space="preserve">🌍</w:t>
+            </w:r>
+            <w:r>
+              <w:t xml:space="preserve"> </w:t>
+            </w:r>
+            <w:r>
+              <w:rPr>
+                <w:b/>
+                <w:bCs/>
+              </w:rPr>
+              <w:t xml:space="preserve">NAT y PAT</w:t>
+            </w:r>
+          </w:p>
+        </w:tc>
+        <w:tc>
+          <w:tcPr/>
+          <w:p>
+            <w:pPr>
+              <w:pStyle w:val="Compact"/>
+            </w:pPr>
+            <w:r>
+              <w:t xml:space="preserve">Dar salida a Internet a una red privada con una sola IP pública</w:t>
+            </w:r>
+          </w:p>
+        </w:tc>
+        <w:tc>
+          <w:tcPr/>
+          <w:p>
+            <w:pPr>
+              <w:pStyle w:val="Compact"/>
+            </w:pPr>
+            <w:r>
+              <w:t xml:space="preserve">Routing (estático y OSPF) y subredes (dirección IP)</w:t>
+            </w:r>
+          </w:p>
+        </w:tc>
+      </w:tr>
+      <w:tr>
+        <w:tc>
+          <w:tcPr/>
+          <w:p>
+            <w:pPr>
+              <w:pStyle w:val="Compact"/>
+            </w:pPr>
+            <w:r>
+              <w:t xml:space="preserve">9</w:t>
             </w:r>
           </w:p>
         </w:tc>
@@ -23926,118 +24038,6 @@
             </w:pPr>
             <w:r>
               <w:t xml:space="preserve">IPs y subredes (dirección IP) y routing (estático y OSPF)</w:t>
-            </w:r>
-          </w:p>
-        </w:tc>
-      </w:tr>
-      <w:tr>
-        <w:tc>
-          <w:tcPr/>
-          <w:p>
-            <w:pPr>
-              <w:pStyle w:val="Compact"/>
-            </w:pPr>
-            <w:r>
-              <w:t xml:space="preserve">8</w:t>
-            </w:r>
-          </w:p>
-        </w:tc>
-        <w:tc>
-          <w:tcPr/>
-          <w:p>
-            <w:pPr>
-              <w:pStyle w:val="Compact"/>
-            </w:pPr>
-            <w:r>
-              <w:t xml:space="preserve">🌍</w:t>
-            </w:r>
-            <w:r>
-              <w:t xml:space="preserve"> </w:t>
-            </w:r>
-            <w:r>
-              <w:rPr>
-                <w:b/>
-                <w:bCs/>
-              </w:rPr>
-              <w:t xml:space="preserve">NAT y PAT</w:t>
-            </w:r>
-          </w:p>
-        </w:tc>
-        <w:tc>
-          <w:tcPr/>
-          <w:p>
-            <w:pPr>
-              <w:pStyle w:val="Compact"/>
-            </w:pPr>
-            <w:r>
-              <w:t xml:space="preserve">Dar salida a Internet a una red privada con una sola IP pública</w:t>
-            </w:r>
-          </w:p>
-        </w:tc>
-        <w:tc>
-          <w:tcPr/>
-          <w:p>
-            <w:pPr>
-              <w:pStyle w:val="Compact"/>
-            </w:pPr>
-            <w:r>
-              <w:t xml:space="preserve">Routing (estático y OSPF) y subredes (dirección IP)</w:t>
-            </w:r>
-          </w:p>
-        </w:tc>
-      </w:tr>
-      <w:tr>
-        <w:tc>
-          <w:tcPr/>
-          <w:p>
-            <w:pPr>
-              <w:pStyle w:val="Compact"/>
-            </w:pPr>
-            <w:r>
-              <w:t xml:space="preserve">9</w:t>
-            </w:r>
-          </w:p>
-        </w:tc>
-        <w:tc>
-          <w:tcPr/>
-          <w:p>
-            <w:pPr>
-              <w:pStyle w:val="Compact"/>
-            </w:pPr>
-            <w:r>
-              <w:t xml:space="preserve">🗄️</w:t>
-            </w:r>
-            <w:r>
-              <w:t xml:space="preserve"> </w:t>
-            </w:r>
-            <w:r>
-              <w:rPr>
-                <w:b/>
-                <w:bCs/>
-              </w:rPr>
-              <w:t xml:space="preserve">Servicios de red</w:t>
-            </w:r>
-          </w:p>
-        </w:tc>
-        <w:tc>
-          <w:tcPr/>
-          <w:p>
-            <w:pPr>
-              <w:pStyle w:val="Compact"/>
-            </w:pPr>
-            <w:r>
-              <w:t xml:space="preserve">Desplegar DHCP, DNS y NTP y diagnosticarlos</w:t>
-            </w:r>
-          </w:p>
-        </w:tc>
-        <w:tc>
-          <w:tcPr/>
-          <w:p>
-            <w:pPr>
-              <w:pStyle w:val="Compact"/>
-            </w:pPr>
-            <w:r>
-              <w:t xml:space="preserve">IPs (dirección IP) y routing (estático)</w:t>
             </w:r>
           </w:p>
         </w:tc>
@@ -24734,18 +24734,18 @@
               <w:pStyle w:val="Compact"/>
             </w:pPr>
             <w:r>
-              <w:t xml:space="preserve">Dirección IP + Enrutamiento estático</w:t>
-            </w:r>
-          </w:p>
-        </w:tc>
-        <w:tc>
-          <w:tcPr/>
-          <w:p>
-            <w:pPr>
-              <w:pStyle w:val="Compact"/>
-            </w:pPr>
-            <w:r>
-              <w:t xml:space="preserve">DHCP reparte IPs y DNS resuelve nombres: sin routing no llegan a nadie</w:t>
+              <w:t xml:space="preserve">Dirección IP + Switching y trunking</w:t>
+            </w:r>
+          </w:p>
+        </w:tc>
+        <w:tc>
+          <w:tcPr/>
+          <w:p>
+            <w:pPr>
+              <w:pStyle w:val="Compact"/>
+            </w:pPr>
+            <w:r>
+              <w:t xml:space="preserve">DHCP reparte direcciones y DNS resuelve nombres: sin switch, VLANs y trunk no hay a quién servir</w:t>
             </w:r>
           </w:p>
         </w:tc>
@@ -24936,18 +24936,18 @@
               <w:pStyle w:val="Compact"/>
             </w:pPr>
             <w:r>
-              <w:t xml:space="preserve">Ethernet → Enrutamiento estático</w:t>
-            </w:r>
-          </w:p>
-        </w:tc>
-        <w:tc>
-          <w:tcPr/>
-          <w:p>
-            <w:pPr>
-              <w:pStyle w:val="Compact"/>
-            </w:pPr>
-            <w:r>
-              <w:t xml:space="preserve">De cero a una red local funcionando: cables, IPs, switches, VLANs y routers</w:t>
+              <w:t xml:space="preserve">Ethernet → Servicios de red</w:t>
+            </w:r>
+          </w:p>
+        </w:tc>
+        <w:tc>
+          <w:tcPr/>
+          <w:p>
+            <w:pPr>
+              <w:pStyle w:val="Compact"/>
+            </w:pPr>
+            <w:r>
+              <w:t xml:space="preserve">De cero a una red local funcionando: cables, IPs, switches, VLANs, trunks y servicios</w:t>
             </w:r>
           </w:p>
         </w:tc>
@@ -24981,18 +24981,18 @@
               <w:pStyle w:val="Compact"/>
             </w:pPr>
             <w:r>
-              <w:t xml:space="preserve">OSPF → Alta disponibilidad</w:t>
-            </w:r>
-          </w:p>
-        </w:tc>
-        <w:tc>
-          <w:tcPr/>
-          <w:p>
-            <w:pPr>
-              <w:pStyle w:val="Compact"/>
-            </w:pPr>
-            <w:r>
-              <w:t xml:space="preserve">OSPF, ACLs, NAT, servicios, WiFi y redundancia: tu red habla con el mundo y no se cae</w:t>
+              <w:t xml:space="preserve">Enrutamiento estático → Alta disponibilidad</w:t>
+            </w:r>
+          </w:p>
+        </w:tc>
+        <w:tc>
+          <w:tcPr/>
+          <w:p>
+            <w:pPr>
+              <w:pStyle w:val="Compact"/>
+            </w:pPr>
+            <w:r>
+              <w:t xml:space="preserve">Rutas, OSPF, NAT, ACLs, WiFi y redundancia: tu red habla con el mundo y no se cae</w:t>
             </w:r>
           </w:p>
         </w:tc>
@@ -25007,13 +25007,13 @@
           <w:b/>
           <w:bCs/>
         </w:rPr>
-        <w:t xml:space="preserve">Primer cuatrimestre (del cableado al enrutamiento estático).</w:t>
-      </w:r>
-      <w:r>
-        <w:t xml:space="preserve"> </w:t>
-      </w:r>
-      <w:r>
-        <w:t xml:space="preserve">Construimos desde los cimientos: qué cables sostienen la red, cómo se direccionan los paquetes, cómo los switches las mantienen ordenadas y separadas en VLANs y cómo los routers las encaminan. Al terminar serás capaz de</w:t>
+        <w:t xml:space="preserve">Primer cuatrimestre (del cableado a los servicios).</w:t>
+      </w:r>
+      <w:r>
+        <w:t xml:space="preserve"> </w:t>
+      </w:r>
+      <w:r>
+        <w:t xml:space="preserve">Construimos desde los cimientos: qué cables sostienen la red, cómo se direccionan los paquetes, cómo los switches las mantienen ordenadas y separadas en VLANs, cómo los trunks las unen y cómo DHCP, DNS y NTP dan de comer a la red. Al terminar serás capaz de</w:t>
       </w:r>
       <w:r>
         <w:t xml:space="preserve"> </w:t>
@@ -25026,7 +25026,7 @@
         <w:t xml:space="preserve">montar y dejar funcionando la red local de un centro educativo pequeño</w:t>
       </w:r>
       <w:r>
-        <w:t xml:space="preserve">, con sus equipos, su cableado y sus VLANs.</w:t>
+        <w:t xml:space="preserve">, con sus equipos, su cableado, sus VLANs y sus servicios.</w:t>
       </w:r>
     </w:p>
     <w:p>
@@ -25038,13 +25038,13 @@
           <w:b/>
           <w:bCs/>
         </w:rPr>
-        <w:t xml:space="preserve">Segundo cuatrimestre (de OSPF a la alta disponibilidad).</w:t>
-      </w:r>
-      <w:r>
-        <w:t xml:space="preserve"> </w:t>
-      </w:r>
-      <w:r>
-        <w:t xml:space="preserve">Es el momento de abrir puertas y cerrar grietas: los routers aprenden rutas solos (OSPF), filtramos quién entra y quién sale (ACLs), conectamos todo a Internet con una sola IP pública (NAT), desplegamos los servicios que hacen que la red sea útil (DHCP, DNS, NTP), llevamos la red al aire (WiFi) y la blindamos contra averías (alta disponibilidad). Aquí tu</w:t>
+        <w:t xml:space="preserve">Segundo cuatrimestre (del enrutamiento a la alta disponibilidad).</w:t>
+      </w:r>
+      <w:r>
+        <w:t xml:space="preserve"> </w:t>
+      </w:r>
+      <w:r>
+        <w:t xml:space="preserve">Es el momento de abrir puertas y cerrar grietas: el router toma el mando (CLI, rutas estáticas y ruta por defecto), los routers aprenden rutas solos (OSPF), conectamos todo a Internet con una sola IP pública (NAT), filtramos quién entra y quién sale (ACLs), llevamos la red al aire (WiFi) y la blindamos contra averías (alta disponibilidad). Aquí tu</w:t>
       </w:r>
       <w:r>
         <w:t xml:space="preserve"> </w:t>
@@ -25893,7 +25893,7 @@
         <w:t xml:space="preserve"> </w:t>
       </w:r>
       <w:r>
-        <w:t xml:space="preserve">la red (del cableado al enrutamiento) y</w:t>
+        <w:t xml:space="preserve">la red (del cableado a los servicios) y</w:t>
       </w:r>
       <w:r>
         <w:t xml:space="preserve"> </w:t>
@@ -25909,7 +25909,7 @@
         <w:t xml:space="preserve"> </w:t>
       </w:r>
       <w:r>
-        <w:t xml:space="preserve">(de OSPF a la alta disponibilidad).</w:t>
+        <w:t xml:space="preserve">(del enrutamiento a la alta disponibilidad).</w:t>
       </w:r>
     </w:p>
     <w:p>

</xml_diff>

<commit_message>
Revisión transversal: CEs oficiales (U06/U09/U11/U12), familia CE (U03/U08), títulos U01 y cross-units
</commit_message>
<xml_diff>
--- a/docx/01-introduccion/01-introduccion.docx
+++ b/docx/01-introduccion/01-introduccion.docx
@@ -4018,7 +4018,7 @@
         <w:pStyle w:val="Heading1"/>
       </w:pPr>
       <w:r>
-        <w:t xml:space="preserve">07 — Instalación de Packet Tracer</w:t>
+        <w:t xml:space="preserve">02 — Instalación de Packet Tracer</w:t>
       </w:r>
     </w:p>
     <w:p>
@@ -5806,7 +5806,7 @@
         <w:pStyle w:val="Heading1"/>
       </w:pPr>
       <w:r>
-        <w:t xml:space="preserve">02 — Los aparatitos</w:t>
+        <w:t xml:space="preserve">03 — Los aparatitos</w:t>
       </w:r>
     </w:p>
     <w:p>
@@ -8084,7 +8084,7 @@
         <w:pStyle w:val="Heading1"/>
       </w:pPr>
       <w:r>
-        <w:t xml:space="preserve">03 — MAC, IP y Puertos</w:t>
+        <w:t xml:space="preserve">04 — MAC, IP y Puertos</w:t>
       </w:r>
     </w:p>
     <w:p>
@@ -10501,7 +10501,7 @@
         <w:pStyle w:val="Heading1"/>
       </w:pPr>
       <w:r>
-        <w:t xml:space="preserve">04 — Paquetes y protocolos</w:t>
+        <w:t xml:space="preserve">05 — Paquetes y protocolos</w:t>
       </w:r>
     </w:p>
     <w:p>
@@ -12994,7 +12994,7 @@
         <w:pStyle w:val="Heading1"/>
       </w:pPr>
       <w:r>
-        <w:t xml:space="preserve">05 — DNS y DHCP</w:t>
+        <w:t xml:space="preserve">06 — DNS y DHCP</w:t>
       </w:r>
     </w:p>
     <w:p>
@@ -15368,7 +15368,7 @@
         <w:pStyle w:val="Heading1"/>
       </w:pPr>
       <w:r>
-        <w:t xml:space="preserve">06 — Método de diagnóstico</w:t>
+        <w:t xml:space="preserve">07 — Método de diagnóstico</w:t>
       </w:r>
     </w:p>
     <w:p>
@@ -18533,7 +18533,7 @@
         <w:pStyle w:val="Heading1"/>
       </w:pPr>
       <w:r>
-        <w:t xml:space="preserve">09 — Glosario</w:t>
+        <w:t xml:space="preserve">08 — Glosario</w:t>
       </w:r>
     </w:p>
     <w:p>
@@ -20927,7 +20927,7 @@
         <w:pStyle w:val="Heading1"/>
       </w:pPr>
       <w:r>
-        <w:t xml:space="preserve">10 — Preguntas tontas</w:t>
+        <w:t xml:space="preserve">09 — Preguntas tontas</w:t>
       </w:r>
     </w:p>
     <w:p>
@@ -23350,7 +23350,7 @@
         <w:pStyle w:val="Heading1"/>
       </w:pPr>
       <w:r>
-        <w:t xml:space="preserve">08 — El mapa del curso</w:t>
+        <w:t xml:space="preserve">10 — El mapa del curso</w:t>
       </w:r>
     </w:p>
     <w:p>

</xml_diff>

<commit_message>
Cierre transversal: diagramas a 0 fallos (fix del checker) y coherencia global (DHCP/HSRP/B6)
</commit_message>
<xml_diff>
--- a/docx/01-introduccion/01-introduccion.docx
+++ b/docx/01-introduccion/01-introduccion.docx
@@ -1982,7 +1982,7 @@
       <w:r>
         <w:drawing>
           <wp:inline>
-            <wp:extent cx="5334000" cy="2721514"/>
+            <wp:extent cx="5334000" cy="2704504"/>
             <wp:effectExtent b="0" l="0" r="0" t="0"/>
             <wp:docPr descr="Las 4 piezas de toda red: dispositivos finales, de interconexión, medio de transmisión y protocolos" title="" id="30" name="Picture"/>
             <a:graphic>
@@ -2012,7 +2012,7 @@
                   <pic:spPr bwMode="auto">
                     <a:xfrm>
                       <a:off x="0" y="0"/>
-                      <a:ext cx="5334000" cy="2721514"/>
+                      <a:ext cx="5334000" cy="2704504"/>
                     </a:xfrm>
                     <a:prstGeom prst="rect">
                       <a:avLst/>
@@ -16182,7 +16182,7 @@
       <w:r>
         <w:drawing>
           <wp:inline>
-            <wp:extent cx="5334000" cy="4026750"/>
+            <wp:extent cx="5334000" cy="4038675"/>
             <wp:effectExtent b="0" l="0" r="0" t="0"/>
             <wp:docPr descr="La Escalera del Ping: de mirar las luces al DNS, peldaño a peldaño, con la avería marcada en rojo" title="" id="138" name="Picture"/>
             <a:graphic>
@@ -16212,7 +16212,7 @@
                   <pic:spPr bwMode="auto">
                     <a:xfrm>
                       <a:off x="0" y="0"/>
-                      <a:ext cx="5334000" cy="4026750"/>
+                      <a:ext cx="5334000" cy="4038675"/>
                     </a:xfrm>
                     <a:prstGeom prst="rect">
                       <a:avLst/>

</xml_diff>

<commit_message>
Reestructura el temario a 13 unidades: nueva U03 Capa de enlace, U02 solo capa 1 y U04 recortada
- U02 pasa a "Medios y cableado" (8 puntos, solo capa 1; OSI y trama salen)
- Nueva U03 "Capa de enlace y trama Ethernet" (5 puntos + indice + 4 boletines)
- U04 recortada 18 a 13 puntos (fusiona clases+privadas; absorbe compresion,
  DHCPv6, config dual-stack y mencion IPv8)
- U04-U12 renumeradas a U05-U13 (slugs, URLs, titulos, breadcrumbs, pies,
  diagramas uNN-*, boletines y sidebar)
- Mapa del curso a 13 etapas + diagrama Excalidraw reeditado
- AGENTS.md/README actualizados; scripts docx/epub con 03-capa-de-enlace
- Checks: check-uds 0, check-links OK, check:unidad 13/13,
  check:diagrams 29/29, build 186, docx 73, epub OK
</commit_message>
<xml_diff>
--- a/docx/01-introduccion/01-introduccion.docx
+++ b/docx/01-introduccion/01-introduccion.docx
@@ -23358,7 +23358,7 @@
         <w:pStyle w:val="FirstParagraph"/>
       </w:pPr>
       <w:r>
-        <w:t xml:space="preserve">Las 12 etapas para pasar de cero a administrador de redes 🗺️</w:t>
+        <w:t xml:space="preserve">Las 13 etapas para pasar de cero a administrador de redes 🗺️</w:t>
       </w:r>
     </w:p>
     <w:p>
@@ -23408,13 +23408,13 @@
         </w:pict>
       </w:r>
     </w:p>
-    <w:bookmarkStart w:id="189" w:name="un-viaje-de-12-paradas"/>
+    <w:bookmarkStart w:id="189" w:name="un-viaje-de-13-paradas"/>
     <w:p>
       <w:pPr>
         <w:pStyle w:val="Heading2"/>
       </w:pPr>
       <w:r>
-        <w:t xml:space="preserve">🗺️ Un viaje de 12 paradas</w:t>
+        <w:t xml:space="preserve">🗺️ Un viaje de 13 paradas</w:t>
       </w:r>
     </w:p>
     <w:p>
@@ -23567,18 +23567,18 @@
                 <w:b/>
                 <w:bCs/>
               </w:rPr>
-              <w:t xml:space="preserve">Ethernet, medios y cableado</w:t>
-            </w:r>
-          </w:p>
-        </w:tc>
-        <w:tc>
-          <w:tcPr/>
-          <w:p>
-            <w:pPr>
-              <w:pStyle w:val="Compact"/>
-            </w:pPr>
-            <w:r>
-              <w:t xml:space="preserve">Elegir entre cobre y fibra, crimpar un latiguillo y leer una trama Ethernet</w:t>
+              <w:t xml:space="preserve">Medios y cableado</w:t>
+            </w:r>
+          </w:p>
+        </w:tc>
+        <w:tc>
+          <w:tcPr/>
+          <w:p>
+            <w:pPr>
+              <w:pStyle w:val="Compact"/>
+            </w:pPr>
+            <w:r>
+              <w:t xml:space="preserve">Elegir entre cobre y fibra y crimpar un latiguillo</w:t>
             </w:r>
           </w:p>
         </w:tc>
@@ -23603,6 +23603,62 @@
             </w:pPr>
             <w:r>
               <w:t xml:space="preserve">2</w:t>
+            </w:r>
+          </w:p>
+        </w:tc>
+        <w:tc>
+          <w:tcPr/>
+          <w:p>
+            <w:pPr>
+              <w:pStyle w:val="Compact"/>
+            </w:pPr>
+            <w:r>
+              <w:t xml:space="preserve">🔗</w:t>
+            </w:r>
+            <w:r>
+              <w:t xml:space="preserve"> </w:t>
+            </w:r>
+            <w:r>
+              <w:rPr>
+                <w:b/>
+                <w:bCs/>
+              </w:rPr>
+              <w:t xml:space="preserve">Capa de enlace y trama Ethernet</w:t>
+            </w:r>
+          </w:p>
+        </w:tc>
+        <w:tc>
+          <w:tcPr/>
+          <w:p>
+            <w:pPr>
+              <w:pStyle w:val="Compact"/>
+            </w:pPr>
+            <w:r>
+              <w:t xml:space="preserve">Situar las capas OSI, leer una MAC y analizar una trama Ethernet</w:t>
+            </w:r>
+          </w:p>
+        </w:tc>
+        <w:tc>
+          <w:tcPr/>
+          <w:p>
+            <w:pPr>
+              <w:pStyle w:val="Compact"/>
+            </w:pPr>
+            <w:r>
+              <w:t xml:space="preserve">Los medios (medios y cableado)</w:t>
+            </w:r>
+          </w:p>
+        </w:tc>
+      </w:tr>
+      <w:tr>
+        <w:tc>
+          <w:tcPr/>
+          <w:p>
+            <w:pPr>
+              <w:pStyle w:val="Compact"/>
+            </w:pPr>
+            <w:r>
+              <w:t xml:space="preserve">3</w:t>
             </w:r>
           </w:p>
         </w:tc>
@@ -23645,7 +23701,7 @@
               <w:pStyle w:val="Compact"/>
             </w:pPr>
             <w:r>
-              <w:t xml:space="preserve">Las IPs y el medio (Ethernet y cableado)</w:t>
+              <w:t xml:space="preserve">El modelo OSI, las MACs (capa de enlace) y el medio</w:t>
             </w:r>
           </w:p>
         </w:tc>
@@ -23658,7 +23714,7 @@
               <w:pStyle w:val="Compact"/>
             </w:pPr>
             <w:r>
-              <w:t xml:space="preserve">3</w:t>
+              <w:t xml:space="preserve">4</w:t>
             </w:r>
           </w:p>
         </w:tc>
@@ -23701,7 +23757,7 @@
               <w:pStyle w:val="Compact"/>
             </w:pPr>
             <w:r>
-              <w:t xml:space="preserve">Qué hace un switch (introducción) y las IPs (dirección IP)</w:t>
+              <w:t xml:space="preserve">Qué hace un switch (introducción), tramas y MACs (capa de enlace) y las IPs (dirección IP)</w:t>
             </w:r>
           </w:p>
         </w:tc>
@@ -23714,7 +23770,7 @@
               <w:pStyle w:val="Compact"/>
             </w:pPr>
             <w:r>
-              <w:t xml:space="preserve">4</w:t>
+              <w:t xml:space="preserve">5</w:t>
             </w:r>
           </w:p>
         </w:tc>
@@ -23770,7 +23826,7 @@
               <w:pStyle w:val="Compact"/>
             </w:pPr>
             <w:r>
-              <w:t xml:space="preserve">5</w:t>
+              <w:t xml:space="preserve">6</w:t>
             </w:r>
           </w:p>
         </w:tc>
@@ -23826,7 +23882,7 @@
               <w:pStyle w:val="Compact"/>
             </w:pPr>
             <w:r>
-              <w:t xml:space="preserve">6</w:t>
+              <w:t xml:space="preserve">7</w:t>
             </w:r>
           </w:p>
         </w:tc>
@@ -23882,7 +23938,7 @@
               <w:pStyle w:val="Compact"/>
             </w:pPr>
             <w:r>
-              <w:t xml:space="preserve">7</w:t>
+              <w:t xml:space="preserve">8</w:t>
             </w:r>
           </w:p>
         </w:tc>
@@ -23938,7 +23994,7 @@
               <w:pStyle w:val="Compact"/>
             </w:pPr>
             <w:r>
-              <w:t xml:space="preserve">8</w:t>
+              <w:t xml:space="preserve">9</w:t>
             </w:r>
           </w:p>
         </w:tc>
@@ -23994,7 +24050,7 @@
               <w:pStyle w:val="Compact"/>
             </w:pPr>
             <w:r>
-              <w:t xml:space="preserve">9</w:t>
+              <w:t xml:space="preserve">10</w:t>
             </w:r>
           </w:p>
         </w:tc>
@@ -24050,7 +24106,7 @@
               <w:pStyle w:val="Compact"/>
             </w:pPr>
             <w:r>
-              <w:t xml:space="preserve">10</w:t>
+              <w:t xml:space="preserve">11</w:t>
             </w:r>
           </w:p>
         </w:tc>
@@ -24093,7 +24149,7 @@
               <w:pStyle w:val="Compact"/>
             </w:pPr>
             <w:r>
-              <w:t xml:space="preserve">Cableado (Ethernet), IPs (dirección IP) y VLANs (switching)</w:t>
+              <w:t xml:space="preserve">Cableado (medios y cableado), IPs (dirección IP) y VLANs (switching)</w:t>
             </w:r>
           </w:p>
         </w:tc>
@@ -24106,7 +24162,7 @@
               <w:pStyle w:val="Compact"/>
             </w:pPr>
             <w:r>
-              <w:t xml:space="preserve">11</w:t>
+              <w:t xml:space="preserve">12</w:t>
             </w:r>
           </w:p>
         </w:tc>
@@ -24188,7 +24244,7 @@
         <w:t xml:space="preserve"> </w:t>
       </w:r>
       <w:r>
-        <w:t xml:space="preserve">del curso: si te saltas un peldaño, el siguiente te va a costar el doble. La introducción (estas páginas) es el vestíbulo: sin ella, Ethernet te sonará a chino.</w:t>
+        <w:t xml:space="preserve">del curso: si te saltas un peldaño, el siguiente te va a costar el doble. La introducción (estas páginas) es el vestíbulo: sin ella, los medios te sonarán a chino.</w:t>
       </w:r>
     </w:p>
     <w:p>
@@ -24198,9 +24254,9 @@
       <w:r>
         <w:drawing>
           <wp:inline>
-            <wp:extent cx="5334000" cy="2436834"/>
+            <wp:extent cx="5334000" cy="2414913"/>
             <wp:effectExtent b="0" l="0" r="0" t="0"/>
-            <wp:docPr descr="El mapa del curso en dos cuatrimestres: de Ethernet a Alta disponibilidad" title="" id="191" name="Picture"/>
+            <wp:docPr descr="El mapa del curso en dos cuatrimestres: de Medios y cableado a Alta disponibilidad" title="" id="191" name="Picture"/>
             <a:graphic>
               <a:graphicData uri="http://schemas.openxmlformats.org/drawingml/2006/picture">
                 <pic:pic>
@@ -24228,7 +24284,7 @@
                   <pic:spPr bwMode="auto">
                     <a:xfrm>
                       <a:off x="0" y="0"/>
-                      <a:ext cx="5334000" cy="2436834"/>
+                      <a:ext cx="5334000" cy="2414913"/>
                     </a:xfrm>
                     <a:prstGeom prst="rect">
                       <a:avLst/>
@@ -24252,7 +24308,7 @@
         <w:pStyle w:val="ImageCaption"/>
       </w:pPr>
       <w:r>
-        <w:t xml:space="preserve">El mapa del curso en dos cuatrimestres: de Ethernet a Alta disponibilidad</w:t>
+        <w:t xml:space="preserve">El mapa del curso en dos cuatrimestres: de Medios y cableado a Alta disponibilidad</w:t>
       </w:r>
     </w:p>
     <w:p>
@@ -24277,7 +24333,7 @@
         <w:pStyle w:val="FirstParagraph"/>
       </w:pPr>
       <w:r>
-        <w:t xml:space="preserve">El mapa de 12 paradas es solo el plano: en la mochila viajan, además, tres cosas que no son unidades pero que te acompañan en todo el recorrido.</w:t>
+        <w:t xml:space="preserve">El mapa de 13 paradas es solo el plano: en la mochila viajan, además, tres cosas que no son unidades pero que te acompañan en todo el recorrido.</w:t>
       </w:r>
     </w:p>
     <w:tbl>
@@ -24487,7 +24543,7 @@
         <w:pStyle w:val="FirstParagraph"/>
       </w:pPr>
       <w:r>
-        <w:t xml:space="preserve">Si la tabla de las 11 etapas era el plano, este mapa de puentes te dice cuándo una unidad se sostiene literalmente sobre la anterior. No es para memorizarlo, es para no sorprenderte:</w:t>
+        <w:t xml:space="preserve">Si la tabla de las 13 etapas era el plano, este mapa de puentes te dice cuándo una unidad se sostiene literalmente sobre la anterior. No es para memorizarlo, es para no sorprenderte:</w:t>
       </w:r>
     </w:p>
     <w:tbl>
@@ -24548,6 +24604,53 @@
               <w:pStyle w:val="Compact"/>
             </w:pPr>
             <w:r>
+              <w:t xml:space="preserve">Direccionamiento IP</w:t>
+            </w:r>
+          </w:p>
+        </w:tc>
+        <w:tc>
+          <w:tcPr/>
+          <w:p>
+            <w:pPr>
+              <w:pStyle w:val="Compact"/>
+            </w:pPr>
+            <w:r>
+              <w:t xml:space="preserve">Medios + Capa de enlace</w:t>
+            </w:r>
+          </w:p>
+        </w:tc>
+        <w:tc>
+          <w:tcPr/>
+          <w:p>
+            <w:pPr>
+              <w:pStyle w:val="Compact"/>
+            </w:pPr>
+            <w:r>
+              <w:t xml:space="preserve">El</w:t>
+            </w:r>
+            <w:r>
+              <w:t xml:space="preserve"> </w:t>
+            </w:r>
+            <w:r>
+              <w:t xml:space="preserve">“sobre”</w:t>
+            </w:r>
+            <w:r>
+              <w:t xml:space="preserve"> </w:t>
+            </w:r>
+            <w:r>
+              <w:t xml:space="preserve">IP viaja dentro de tramas Ethernet: sin MACs no hay envío</w:t>
+            </w:r>
+          </w:p>
+        </w:tc>
+      </w:tr>
+      <w:tr>
+        <w:tc>
+          <w:tcPr/>
+          <w:p>
+            <w:pPr>
+              <w:pStyle w:val="Compact"/>
+            </w:pPr>
+            <w:r>
               <w:t xml:space="preserve">IPv6</w:t>
             </w:r>
           </w:p>
@@ -24841,7 +24944,7 @@
         <w:pStyle w:val="FirstParagraph"/>
       </w:pPr>
       <w:r>
-        <w:t xml:space="preserve">Para no perderte en las 12 paradas, recuerda que el curso se organiza en</w:t>
+        <w:t xml:space="preserve">Para no perderte en las 13 paradas, recuerda que el curso se organiza en</w:t>
       </w:r>
       <w:r>
         <w:t xml:space="preserve"> </w:t>
@@ -24936,18 +25039,18 @@
               <w:pStyle w:val="Compact"/>
             </w:pPr>
             <w:r>
-              <w:t xml:space="preserve">Ethernet → Servicios de red</w:t>
-            </w:r>
-          </w:p>
-        </w:tc>
-        <w:tc>
-          <w:tcPr/>
-          <w:p>
-            <w:pPr>
-              <w:pStyle w:val="Compact"/>
-            </w:pPr>
-            <w:r>
-              <w:t xml:space="preserve">De cero a una red local funcionando: cables, IPs, switches, VLANs, trunks y servicios</w:t>
+              <w:t xml:space="preserve">Medios y cableado → Servicios de red</w:t>
+            </w:r>
+          </w:p>
+        </w:tc>
+        <w:tc>
+          <w:tcPr/>
+          <w:p>
+            <w:pPr>
+              <w:pStyle w:val="Compact"/>
+            </w:pPr>
+            <w:r>
+              <w:t xml:space="preserve">De cero a una red local funcionando: cables, tramas, IPs, switches, VLANs, trunks y servicios</w:t>
             </w:r>
           </w:p>
         </w:tc>
@@ -25563,6 +25666,30 @@
               <w:pStyle w:val="Compact"/>
             </w:pPr>
             <w:r>
+              <w:t xml:space="preserve">El paquete se envuelve en tramas con MACs</w:t>
+            </w:r>
+          </w:p>
+        </w:tc>
+        <w:tc>
+          <w:tcPr/>
+          <w:p>
+            <w:pPr>
+              <w:pStyle w:val="Compact"/>
+            </w:pPr>
+            <w:r>
+              <w:t xml:space="preserve">Capa de enlace y trama Ethernet</w:t>
+            </w:r>
+          </w:p>
+        </w:tc>
+      </w:tr>
+      <w:tr>
+        <w:tc>
+          <w:tcPr/>
+          <w:p>
+            <w:pPr>
+              <w:pStyle w:val="Compact"/>
+            </w:pPr>
+            <w:r>
               <w:t xml:space="preserve">El paquete recorre tu edificio por cable</w:t>
             </w:r>
           </w:p>
@@ -25574,7 +25701,7 @@
               <w:pStyle w:val="Compact"/>
             </w:pPr>
             <w:r>
-              <w:t xml:space="preserve">Ethernet y cableado + Switching y VLAN</w:t>
+              <w:t xml:space="preserve">Medios y cableado + Switching y VLAN</w:t>
             </w:r>
           </w:p>
         </w:tc>
@@ -25865,7 +25992,7 @@
         </w:numPr>
       </w:pPr>
       <w:r>
-        <w:t xml:space="preserve">El curso es un viaje en orden: 12 unidades donde cada una se apoya en la anterior y los saltos se pagan caros.</w:t>
+        <w:t xml:space="preserve">El curso es un viaje en orden: 13 unidades donde cada una se apoya en la anterior y los saltos se pagan caros.</w:t>
       </w:r>
     </w:p>
     <w:p>
@@ -25993,7 +26120,7 @@
           <w:rPr>
             <w:rStyle w:val="Hyperlink"/>
           </w:rPr>
-          <w:t xml:space="preserve">Ethernet y cableado</w:t>
+          <w:t xml:space="preserve">Medios y cableado</w:t>
         </w:r>
       </w:hyperlink>
     </w:p>

</xml_diff>